<commit_message>
Preenchido o campo das Quinzenas 1 e 2 do Willian
</commit_message>
<xml_diff>
--- a/Plano de Acao.docx
+++ b/Plano de Acao.docx
@@ -2103,6 +2103,7 @@
                 <w:szCs w:val="22"/>
                 <w:lang w:val="pt-BR" w:eastAsia="pt-BR" w:bidi="ar-SA"/>
               </w:rPr>
+              <w:t>Levantamento do problema e pesquisa de campo</w:t>
             </w:r>
           </w:p>
         </w:tc>
@@ -2142,6 +2143,7 @@
                 <w:szCs w:val="22"/>
                 <w:lang w:val="pt-BR" w:eastAsia="pt-BR" w:bidi="ar-SA"/>
               </w:rPr>
+              <w:t>Willian Silveira Vantier</w:t>
             </w:r>
           </w:p>
         </w:tc>
@@ -2181,6 +2183,7 @@
                 <w:szCs w:val="22"/>
                 <w:lang w:val="pt-BR" w:eastAsia="pt-BR" w:bidi="ar-SA"/>
               </w:rPr>
+              <w:t>16/02/2026</w:t>
             </w:r>
           </w:p>
         </w:tc>
@@ -2220,6 +2223,7 @@
                 <w:szCs w:val="22"/>
                 <w:lang w:val="pt-BR" w:eastAsia="pt-BR" w:bidi="ar-SA"/>
               </w:rPr>
+              <w:t>27/02/2026</w:t>
             </w:r>
           </w:p>
         </w:tc>
@@ -3446,6 +3450,18 @@
                 <w:szCs w:val="22"/>
                 <w:lang w:val="pt-BR" w:eastAsia="pt-BR" w:bidi="ar-SA"/>
               </w:rPr>
+              <w:t>Preenchimento do Plano de Aç</w:t>
+            </w:r>
+            <w:r>
+              <w:rPr>
+                <w:rFonts w:eastAsia="Calibri" w:cs="Calibri"/>
+                <w:color w:val="auto"/>
+                <w:kern w:val="0"/>
+                <w:sz w:val="22"/>
+                <w:szCs w:val="22"/>
+                <w:lang w:val="pt-BR" w:eastAsia="pt-BR" w:bidi="ar-SA"/>
+              </w:rPr>
+              <w:t>ão</w:t>
             </w:r>
           </w:p>
         </w:tc>
@@ -3485,6 +3501,7 @@
                 <w:szCs w:val="22"/>
                 <w:lang w:val="pt-BR" w:eastAsia="pt-BR" w:bidi="ar-SA"/>
               </w:rPr>
+              <w:t>Willian Silveira Vantier</w:t>
             </w:r>
           </w:p>
         </w:tc>
@@ -3524,6 +3541,7 @@
                 <w:szCs w:val="22"/>
                 <w:lang w:val="pt-BR" w:eastAsia="pt-BR" w:bidi="ar-SA"/>
               </w:rPr>
+              <w:t>02/03/2026</w:t>
             </w:r>
           </w:p>
         </w:tc>
@@ -3563,6 +3581,7 @@
                 <w:szCs w:val="22"/>
                 <w:lang w:val="pt-BR" w:eastAsia="pt-BR" w:bidi="ar-SA"/>
               </w:rPr>
+              <w:t>06/03/2026</w:t>
             </w:r>
           </w:p>
         </w:tc>

</xml_diff>